<commit_message>
inclusão de gráficos e ajustes no relatório trimestral
</commit_message>
<xml_diff>
--- a/output/relatorio_trimestral_2026T2_antigo.docx
+++ b/output/relatorio_trimestral_2026T2_antigo.docx
@@ -2647,6 +2647,544 @@
           <w:b/>
           <w:bCs/>
         </w:rPr>
+        <w:t>DIMENSÕES DOS INDICADORES</w:t>
+      </w:r>
+    </w:p>
+    <w:p>
+      <w:pPr>
+        <w:rPr>
+          <w:b/>
+          <w:bCs/>
+        </w:rPr>
+      </w:pPr>
+    </w:p>
+    <w:tbl>
+      <w:tblPr>
+        <w:tblStyle w:val="Tabelacomgrade"/>
+        <w:tblW w:w="0" w:type="auto"/>
+        <w:tblLook w:val="04A0" w:firstRow="1" w:lastRow="0" w:firstColumn="1" w:lastColumn="0" w:noHBand="0" w:noVBand="1"/>
+      </w:tblPr>
+      <w:tblGrid>
+        <w:gridCol w:w="1842"/>
+        <w:gridCol w:w="1842"/>
+        <w:gridCol w:w="1842"/>
+        <w:gridCol w:w="1842"/>
+        <w:gridCol w:w="1843"/>
+      </w:tblGrid>
+      <w:tr>
+        <w:tc>
+          <w:tcPr>
+            <w:tcW w:w="1842" w:type="dxa"/>
+          </w:tcPr>
+          <w:p>
+            <w:pPr>
+              <w:ind w:firstLine="0"/>
+              <w:rPr>
+                <w:b/>
+                <w:bCs/>
+              </w:rPr>
+            </w:pPr>
+            <w:r>
+              <w:rPr>
+                <w:b/>
+                <w:bCs/>
+              </w:rPr>
+              <w:t>Dimensão</w:t>
+            </w:r>
+          </w:p>
+        </w:tc>
+        <w:tc>
+          <w:tcPr>
+            <w:tcW w:w="1842" w:type="dxa"/>
+          </w:tcPr>
+          <w:p>
+            <w:pPr>
+              <w:ind w:firstLine="0"/>
+              <w:rPr>
+                <w:b/>
+                <w:bCs/>
+              </w:rPr>
+            </w:pPr>
+            <w:r>
+              <w:rPr>
+                <w:b/>
+                <w:bCs/>
+              </w:rPr>
+              <w:t>Medida</w:t>
+            </w:r>
+          </w:p>
+        </w:tc>
+        <w:tc>
+          <w:tcPr>
+            <w:tcW w:w="1842" w:type="dxa"/>
+          </w:tcPr>
+          <w:p>
+            <w:pPr>
+              <w:ind w:firstLine="0"/>
+              <w:rPr>
+                <w:b/>
+                <w:bCs/>
+              </w:rPr>
+            </w:pPr>
+            <w:r>
+              <w:rPr>
+                <w:b/>
+                <w:bCs/>
+              </w:rPr>
+              <w:t>Indicador</w:t>
+            </w:r>
+          </w:p>
+        </w:tc>
+        <w:tc>
+          <w:tcPr>
+            <w:tcW w:w="1842" w:type="dxa"/>
+          </w:tcPr>
+          <w:p>
+            <w:pPr>
+              <w:ind w:firstLine="0"/>
+              <w:rPr>
+                <w:b/>
+                <w:bCs/>
+              </w:rPr>
+            </w:pPr>
+          </w:p>
+        </w:tc>
+        <w:tc>
+          <w:tcPr>
+            <w:tcW w:w="1843" w:type="dxa"/>
+          </w:tcPr>
+          <w:p>
+            <w:pPr>
+              <w:ind w:firstLine="0"/>
+              <w:rPr>
+                <w:b/>
+                <w:bCs/>
+              </w:rPr>
+            </w:pPr>
+          </w:p>
+        </w:tc>
+      </w:tr>
+      <w:tr>
+        <w:tc>
+          <w:tcPr>
+            <w:tcW w:w="1842" w:type="dxa"/>
+          </w:tcPr>
+          <w:p>
+            <w:pPr>
+              <w:ind w:firstLine="0"/>
+              <w:rPr>
+                <w:b/>
+                <w:bCs/>
+              </w:rPr>
+            </w:pPr>
+            <w:r>
+              <w:rPr>
+                <w:b/>
+                <w:bCs/>
+              </w:rPr>
+              <w:t xml:space="preserve">Perfil demográfico da população em idade de </w:t>
+            </w:r>
+            <w:r>
+              <w:rPr>
+                <w:b/>
+                <w:bCs/>
+              </w:rPr>
+              <w:lastRenderedPageBreak/>
+              <w:t>trabalhar</w:t>
+            </w:r>
+          </w:p>
+        </w:tc>
+        <w:tc>
+          <w:tcPr>
+            <w:tcW w:w="1842" w:type="dxa"/>
+          </w:tcPr>
+          <w:p>
+            <w:pPr>
+              <w:ind w:firstLine="0"/>
+              <w:rPr>
+                <w:b/>
+                <w:bCs/>
+              </w:rPr>
+            </w:pPr>
+            <w:r>
+              <w:rPr>
+                <w:b/>
+                <w:bCs/>
+              </w:rPr>
+              <w:lastRenderedPageBreak/>
+              <w:t>Total</w:t>
+            </w:r>
+          </w:p>
+          <w:p>
+            <w:pPr>
+              <w:ind w:firstLine="0"/>
+              <w:rPr>
+                <w:b/>
+                <w:bCs/>
+              </w:rPr>
+            </w:pPr>
+          </w:p>
+        </w:tc>
+        <w:tc>
+          <w:tcPr>
+            <w:tcW w:w="1842" w:type="dxa"/>
+          </w:tcPr>
+          <w:p>
+            <w:pPr>
+              <w:ind w:firstLine="0"/>
+              <w:rPr>
+                <w:b/>
+                <w:bCs/>
+              </w:rPr>
+            </w:pPr>
+          </w:p>
+        </w:tc>
+        <w:tc>
+          <w:tcPr>
+            <w:tcW w:w="1842" w:type="dxa"/>
+          </w:tcPr>
+          <w:p>
+            <w:pPr>
+              <w:ind w:firstLine="0"/>
+              <w:rPr>
+                <w:b/>
+                <w:bCs/>
+              </w:rPr>
+            </w:pPr>
+          </w:p>
+        </w:tc>
+        <w:tc>
+          <w:tcPr>
+            <w:tcW w:w="1843" w:type="dxa"/>
+          </w:tcPr>
+          <w:p>
+            <w:pPr>
+              <w:ind w:firstLine="0"/>
+              <w:rPr>
+                <w:b/>
+                <w:bCs/>
+              </w:rPr>
+            </w:pPr>
+          </w:p>
+        </w:tc>
+      </w:tr>
+      <w:tr>
+        <w:tc>
+          <w:tcPr>
+            <w:tcW w:w="1842" w:type="dxa"/>
+          </w:tcPr>
+          <w:p>
+            <w:pPr>
+              <w:ind w:firstLine="0"/>
+              <w:rPr>
+                <w:b/>
+                <w:bCs/>
+              </w:rPr>
+            </w:pPr>
+          </w:p>
+        </w:tc>
+        <w:tc>
+          <w:tcPr>
+            <w:tcW w:w="1842" w:type="dxa"/>
+          </w:tcPr>
+          <w:p>
+            <w:pPr>
+              <w:ind w:firstLine="0"/>
+              <w:rPr>
+                <w:b/>
+                <w:bCs/>
+              </w:rPr>
+            </w:pPr>
+          </w:p>
+        </w:tc>
+        <w:tc>
+          <w:tcPr>
+            <w:tcW w:w="1842" w:type="dxa"/>
+          </w:tcPr>
+          <w:p>
+            <w:pPr>
+              <w:ind w:firstLine="0"/>
+              <w:rPr>
+                <w:b/>
+                <w:bCs/>
+              </w:rPr>
+            </w:pPr>
+          </w:p>
+        </w:tc>
+        <w:tc>
+          <w:tcPr>
+            <w:tcW w:w="1842" w:type="dxa"/>
+          </w:tcPr>
+          <w:p>
+            <w:pPr>
+              <w:ind w:firstLine="0"/>
+              <w:rPr>
+                <w:b/>
+                <w:bCs/>
+              </w:rPr>
+            </w:pPr>
+          </w:p>
+        </w:tc>
+        <w:tc>
+          <w:tcPr>
+            <w:tcW w:w="1843" w:type="dxa"/>
+          </w:tcPr>
+          <w:p>
+            <w:pPr>
+              <w:ind w:firstLine="0"/>
+              <w:rPr>
+                <w:b/>
+                <w:bCs/>
+              </w:rPr>
+            </w:pPr>
+          </w:p>
+        </w:tc>
+      </w:tr>
+      <w:tr>
+        <w:tc>
+          <w:tcPr>
+            <w:tcW w:w="1842" w:type="dxa"/>
+          </w:tcPr>
+          <w:p>
+            <w:pPr>
+              <w:ind w:firstLine="0"/>
+              <w:rPr>
+                <w:b/>
+                <w:bCs/>
+              </w:rPr>
+            </w:pPr>
+          </w:p>
+        </w:tc>
+        <w:tc>
+          <w:tcPr>
+            <w:tcW w:w="1842" w:type="dxa"/>
+          </w:tcPr>
+          <w:p>
+            <w:pPr>
+              <w:ind w:firstLine="0"/>
+              <w:rPr>
+                <w:b/>
+                <w:bCs/>
+              </w:rPr>
+            </w:pPr>
+          </w:p>
+        </w:tc>
+        <w:tc>
+          <w:tcPr>
+            <w:tcW w:w="1842" w:type="dxa"/>
+          </w:tcPr>
+          <w:p>
+            <w:pPr>
+              <w:ind w:firstLine="0"/>
+              <w:rPr>
+                <w:b/>
+                <w:bCs/>
+              </w:rPr>
+            </w:pPr>
+          </w:p>
+        </w:tc>
+        <w:tc>
+          <w:tcPr>
+            <w:tcW w:w="1842" w:type="dxa"/>
+          </w:tcPr>
+          <w:p>
+            <w:pPr>
+              <w:ind w:firstLine="0"/>
+              <w:rPr>
+                <w:b/>
+                <w:bCs/>
+              </w:rPr>
+            </w:pPr>
+          </w:p>
+        </w:tc>
+        <w:tc>
+          <w:tcPr>
+            <w:tcW w:w="1843" w:type="dxa"/>
+          </w:tcPr>
+          <w:p>
+            <w:pPr>
+              <w:ind w:firstLine="0"/>
+              <w:rPr>
+                <w:b/>
+                <w:bCs/>
+              </w:rPr>
+            </w:pPr>
+          </w:p>
+        </w:tc>
+      </w:tr>
+      <w:tr>
+        <w:tc>
+          <w:tcPr>
+            <w:tcW w:w="1842" w:type="dxa"/>
+          </w:tcPr>
+          <w:p>
+            <w:pPr>
+              <w:ind w:firstLine="0"/>
+              <w:rPr>
+                <w:b/>
+                <w:bCs/>
+              </w:rPr>
+            </w:pPr>
+          </w:p>
+        </w:tc>
+        <w:tc>
+          <w:tcPr>
+            <w:tcW w:w="1842" w:type="dxa"/>
+          </w:tcPr>
+          <w:p>
+            <w:pPr>
+              <w:ind w:firstLine="0"/>
+              <w:rPr>
+                <w:b/>
+                <w:bCs/>
+              </w:rPr>
+            </w:pPr>
+          </w:p>
+        </w:tc>
+        <w:tc>
+          <w:tcPr>
+            <w:tcW w:w="1842" w:type="dxa"/>
+          </w:tcPr>
+          <w:p>
+            <w:pPr>
+              <w:ind w:firstLine="0"/>
+              <w:rPr>
+                <w:b/>
+                <w:bCs/>
+              </w:rPr>
+            </w:pPr>
+          </w:p>
+        </w:tc>
+        <w:tc>
+          <w:tcPr>
+            <w:tcW w:w="1842" w:type="dxa"/>
+          </w:tcPr>
+          <w:p>
+            <w:pPr>
+              <w:ind w:firstLine="0"/>
+              <w:rPr>
+                <w:b/>
+                <w:bCs/>
+              </w:rPr>
+            </w:pPr>
+          </w:p>
+        </w:tc>
+        <w:tc>
+          <w:tcPr>
+            <w:tcW w:w="1843" w:type="dxa"/>
+          </w:tcPr>
+          <w:p>
+            <w:pPr>
+              <w:ind w:firstLine="0"/>
+              <w:rPr>
+                <w:b/>
+                <w:bCs/>
+              </w:rPr>
+            </w:pPr>
+          </w:p>
+        </w:tc>
+      </w:tr>
+      <w:tr>
+        <w:tc>
+          <w:tcPr>
+            <w:tcW w:w="1842" w:type="dxa"/>
+          </w:tcPr>
+          <w:p>
+            <w:pPr>
+              <w:ind w:firstLine="0"/>
+              <w:rPr>
+                <w:b/>
+                <w:bCs/>
+              </w:rPr>
+            </w:pPr>
+          </w:p>
+        </w:tc>
+        <w:tc>
+          <w:tcPr>
+            <w:tcW w:w="1842" w:type="dxa"/>
+          </w:tcPr>
+          <w:p>
+            <w:pPr>
+              <w:ind w:firstLine="0"/>
+              <w:rPr>
+                <w:b/>
+                <w:bCs/>
+              </w:rPr>
+            </w:pPr>
+          </w:p>
+        </w:tc>
+        <w:tc>
+          <w:tcPr>
+            <w:tcW w:w="1842" w:type="dxa"/>
+          </w:tcPr>
+          <w:p>
+            <w:pPr>
+              <w:ind w:firstLine="0"/>
+              <w:rPr>
+                <w:b/>
+                <w:bCs/>
+              </w:rPr>
+            </w:pPr>
+          </w:p>
+        </w:tc>
+        <w:tc>
+          <w:tcPr>
+            <w:tcW w:w="1842" w:type="dxa"/>
+          </w:tcPr>
+          <w:p>
+            <w:pPr>
+              <w:ind w:firstLine="0"/>
+              <w:rPr>
+                <w:b/>
+                <w:bCs/>
+              </w:rPr>
+            </w:pPr>
+          </w:p>
+        </w:tc>
+        <w:tc>
+          <w:tcPr>
+            <w:tcW w:w="1843" w:type="dxa"/>
+          </w:tcPr>
+          <w:p>
+            <w:pPr>
+              <w:ind w:firstLine="0"/>
+              <w:rPr>
+                <w:b/>
+                <w:bCs/>
+              </w:rPr>
+            </w:pPr>
+          </w:p>
+        </w:tc>
+      </w:tr>
+    </w:tbl>
+    <w:p>
+      <w:pPr>
+        <w:rPr>
+          <w:b/>
+          <w:bCs/>
+        </w:rPr>
+      </w:pPr>
+    </w:p>
+    <w:p>
+      <w:pPr>
+        <w:rPr>
+          <w:b/>
+          <w:bCs/>
+        </w:rPr>
+      </w:pPr>
+    </w:p>
+    <w:p>
+      <w:pPr>
+        <w:rPr>
+          <w:b/>
+          <w:bCs/>
+        </w:rPr>
+      </w:pPr>
+      <w:r>
+        <w:rPr>
+          <w:b/>
+          <w:bCs/>
+        </w:rPr>
         <w:t xml:space="preserve">2.2. </w:t>
       </w:r>
       <w:r>
@@ -2672,11 +3210,7 @@
     </w:p>
     <w:p>
       <w:r>
-        <w:t xml:space="preserve">Dentro do Piauí, serão feitos quatro recortes geográficos. No primeiro, compararemos </w:t>
-      </w:r>
-      <w:r>
-        <w:lastRenderedPageBreak/>
-        <w:t>zona urbana e zona rural. Esse recorte não é nenhuma novidade em comparação as outras, mas serve ao propósito de elucidar mais ainda as diferenças econômicas entre os tipos de áreas.</w:t>
+        <w:t>Dentro do Piauí, serão feitos quatro recortes geográficos. No primeiro, compararemos zona urbana e zona rural. Esse recorte não é nenhuma novidade em comparação as outras, mas serve ao propósito de elucidar mais ainda as diferenças econômicas entre os tipos de áreas.</w:t>
       </w:r>
     </w:p>
     <w:p>
@@ -2784,7 +3318,6 @@
         <w:rPr>
           <w:noProof/>
         </w:rPr>
-        <w:lastRenderedPageBreak/>
         <w:drawing>
           <wp:inline distT="0" distB="0" distL="0" distR="0" wp14:anchorId="4EBA929C" wp14:editId="18B3D4E2">
             <wp:extent cx="5760085" cy="6911975"/>
@@ -2952,7 +3485,6 @@
     </w:p>
     <w:p>
       <w:r>
-        <w:lastRenderedPageBreak/>
         <w:t>Como a PNADC é uma pesquisa amostral</w:t>
       </w:r>
       <w:r>
@@ -3114,7 +3646,11 @@
     </w:p>
     <w:p>
       <w:r>
-        <w:t xml:space="preserve">Iremos avaliar de forma mais concreta os estimadores com CV abaixo de 15%, pois são bem mais confiáveis. Os resultados completos, para todos os níveis de recorte e seus respectivos </w:t>
+        <w:t xml:space="preserve">Iremos avaliar de forma mais concreta os estimadores com CV abaixo de 15%, pois são bem mais confiáveis. Os resultados completos, para todos os níveis de recorte e seus </w:t>
+      </w:r>
+      <w:r>
+        <w:lastRenderedPageBreak/>
+        <w:t xml:space="preserve">respectivos </w:t>
       </w:r>
       <w:proofErr w:type="spellStart"/>
       <w:r>
@@ -3138,7 +3674,6 @@
           <w:b/>
           <w:bCs/>
         </w:rPr>
-        <w:lastRenderedPageBreak/>
         <w:t>2.4 Comparações entre os recortes</w:t>
       </w:r>
     </w:p>
@@ -3283,7 +3818,11 @@
         <w:pStyle w:val="Corpodetexto"/>
       </w:pPr>
       <w:r>
-        <w:t xml:space="preserve">Por fim, a última linha de cada tabela traz o teste que responde se as diferenças entre as categorias daquele recorte são estatisticamente significativas - os testes descritos na seção 2.5. É esse teste, e não a inspeção visual da tabela, que autoriza afirmar que dois estratos são diferentes. O p-valor usado é o </w:t>
+        <w:t xml:space="preserve">Por fim, a última linha de cada tabela traz o teste que responde se as diferenças entre </w:t>
+      </w:r>
+      <w:r>
+        <w:lastRenderedPageBreak/>
+        <w:t xml:space="preserve">as categorias daquele recorte são estatisticamente significativas - os testes descritos na seção 2.5. É esse teste, e não a inspeção visual da tabela, que autoriza afirmar que dois estratos são diferentes. O p-valor usado é o </w:t>
       </w:r>
       <w:r>
         <w:rPr>
@@ -3302,7 +3841,6 @@
       </w:pPr>
       <w:bookmarkStart w:id="1" w:name="desocupação"/>
       <w:r>
-        <w:lastRenderedPageBreak/>
         <w:t>3.</w:t>
       </w:r>
       <w:r>
@@ -5232,7 +5770,11 @@
         <w:pStyle w:val="Corpodetexto"/>
       </w:pPr>
       <w:r>
-        <w:t>A diferença entre Teresina e o restante do estado não alcançou significância estatística neste trimestre (p ajustado = 0,064), o que recomenda cautela antes de tratá-la como um padrão consolidado.</w:t>
+        <w:t xml:space="preserve">A diferença entre Teresina e o restante do estado não alcançou significância estatística neste trimestre (p ajustado = 0,064), o que recomenda cautela antes de tratá-la como um </w:t>
+      </w:r>
+      <w:r>
+        <w:lastRenderedPageBreak/>
+        <w:t>padrão consolidado.</w:t>
       </w:r>
     </w:p>
     <w:p>
@@ -5240,11 +5782,7 @@
         <w:pStyle w:val="Corpodetexto"/>
       </w:pPr>
       <w:r>
-        <w:t xml:space="preserve">A comparação entre zona urbana e rural merece atenção específica, porque a desocupação rural costuma ser estruturalmente mais baixa: parte da população ocupada na agricultura familiar não procura, e muitas vezes se ocupam mais com produção por subsistência (verificar esse mecanismo) trabalho no sentido que a pesquisa capta, e por isso </w:t>
-      </w:r>
-      <w:r>
-        <w:lastRenderedPageBreak/>
-        <w:t>não é contada como desocupada. Neste trimestre a diferença foi de 3,4 pontos (*).</w:t>
+        <w:t>A comparação entre zona urbana e rural merece atenção específica, porque a desocupação rural costuma ser estruturalmente mais baixa: parte da população ocupada na agricultura familiar não procura, e muitas vezes se ocupam mais com produção por subsistência (verificar esse mecanismo) trabalho no sentido que a pesquisa capta, e por isso não é contada como desocupada. Neste trimestre a diferença foi de 3,4 pontos (*).</w:t>
       </w:r>
     </w:p>
     <w:p>
@@ -7180,6 +7718,7 @@
         <w:pStyle w:val="Corpodetexto"/>
       </w:pPr>
       <w:r>
+        <w:lastRenderedPageBreak/>
         <w:t>Fonte: IBGE — PNAD Contínua trimestral, microdados. Elaboração própria.</w:t>
       </w:r>
       <w:bookmarkStart w:id="4" w:name="Xc76167837fba252ecd20b236dca1fc167620c72"/>
@@ -7201,11 +7740,7 @@
         <w:t>consequências</w:t>
       </w:r>
       <w:r>
-        <w:t xml:space="preserve"> de desocupação no orçamento da família são maiores no resto </w:t>
-      </w:r>
-      <w:r>
-        <w:lastRenderedPageBreak/>
-        <w:t>do estado do que na capital.</w:t>
+        <w:t xml:space="preserve"> de desocupação no orçamento da família são maiores no resto do estado do que na capital.</w:t>
       </w:r>
       <w:r>
         <w:t xml:space="preserve"> </w:t>
@@ -9151,11 +9686,8 @@
         <w:pStyle w:val="Corpodetexto"/>
       </w:pPr>
       <w:r>
-        <w:t xml:space="preserve">Ao ampliarmos o indicador para considerar o companheiro da responsável familiar, a diferença entre a proporção da capital e o resto do estado se amplia. Em Teresina, 41,4% dos desocupados eram chefes de famílias ou conjugues dos chefes, enquanto que no resto estado eram 62,5%. O principal contraste desse resultado é que captura um dos problemas da pesquisa da PNAD Continua: em domicílios cuja família é do tipo nuclear, normalmente a </w:t>
-      </w:r>
-      <w:r>
         <w:lastRenderedPageBreak/>
-        <w:t xml:space="preserve">pessoa que responde o questionário é mulher do casal, o que </w:t>
+        <w:t xml:space="preserve">Ao ampliarmos o indicador para considerar o companheiro da responsável familiar, a diferença entre a proporção da capital e o resto do estado se amplia. Em Teresina, 41,4% dos desocupados eram chefes de famílias ou conjugues dos chefes, enquanto que no resto estado eram 62,5%. O principal contraste desse resultado é que captura um dos problemas da pesquisa da PNAD Continua: em domicílios cuja família é do tipo nuclear, normalmente a pessoa que responde o questionário é mulher do casal, o que </w:t>
       </w:r>
       <w:r>
         <w:t>sub-representação</w:t>
@@ -9215,10 +9747,7 @@
         <w:pStyle w:val="Corpodetexto"/>
       </w:pPr>
       <w:r>
-        <w:t>Antes de tudo, r</w:t>
-      </w:r>
-      <w:r>
-        <w:t>essalta-se que a média de rendimento é sensível a valores muito altos e, em territórios pequenos, um punhado de rendimentos elevados desloca o resultado inteiro. A distribuição completa dos rendimentos por estrato está no anexo metodológico, e é ela que revela se a média representa a maioria ou é puxada pela cauda.</w:t>
+        <w:t>Antes de tudo, ressalta-se que a média de rendimento é sensível a valores muito altos e, em territórios pequenos, um punhado de rendimentos elevados desloca o resultado inteiro. A distribuição completa dos rendimentos por estrato está no anexo metodológico, e é ela que revela se a média representa a maioria ou é puxada pela cauda.</w:t>
       </w:r>
     </w:p>
     <w:p>
@@ -10742,7 +11271,11 @@
         <w:t>Tabela 9</w:t>
       </w:r>
       <w:r>
-        <w:t xml:space="preserve"> — Rendimento médio real habitualmente recebido em todos os trabalhos, diferença entre as categorias de cada recorte — 2º trimestre de 2026</w:t>
+        <w:t xml:space="preserve"> — Rendimento médio real habitualmente recebido em todos os trabalhos, </w:t>
+      </w:r>
+      <w:r>
+        <w:lastRenderedPageBreak/>
+        <w:t>diferença entre as categorias de cada recorte — 2º trimestre de 2026</w:t>
       </w:r>
     </w:p>
     <w:tbl>
@@ -11115,7 +11648,6 @@
         <w:pStyle w:val="Corpodetexto"/>
       </w:pPr>
       <w:r>
-        <w:lastRenderedPageBreak/>
         <w:t>Fonte: IBGE — PNAD Contínua trimestral, microdados. Elaboração própria.</w:t>
       </w:r>
     </w:p>
@@ -12692,7 +13224,11 @@
         <w:t>Tabela 11</w:t>
       </w:r>
       <w:r>
-        <w:t xml:space="preserve"> — Sub-remuneração por hora trabalhada, diferença entre as categorias de cada recorte — 2º trimestre de 2026</w:t>
+        <w:t xml:space="preserve"> — Sub-remuneração por hora trabalhada, diferença entre as categorias de </w:t>
+      </w:r>
+      <w:r>
+        <w:lastRenderedPageBreak/>
+        <w:t>cada recorte — 2º trimestre de 2026</w:t>
       </w:r>
     </w:p>
     <w:tbl>
@@ -13065,7 +13601,6 @@
         <w:pStyle w:val="Corpodetexto"/>
       </w:pPr>
       <w:r>
-        <w:lastRenderedPageBreak/>
         <w:t>Fonte: IBGE — PNAD Contínua trimestral, microdados. Elaboração própria.</w:t>
       </w:r>
     </w:p>
@@ -14874,6 +15409,7 @@
           <w:b/>
           <w:bCs/>
         </w:rPr>
+        <w:lastRenderedPageBreak/>
         <w:t>assimétrico</w:t>
       </w:r>
       <w:r>
@@ -14885,11 +15421,7 @@
         <w:pStyle w:val="Corpodetexto"/>
       </w:pPr>
       <w:r>
-        <w:t xml:space="preserve">Vale contrastar com a capital: em Teresina a razão foi de 2,12, a mais baixa entre os recortes agregados — não porque o formal pague pouco ali, mas porque o informal </w:t>
-      </w:r>
-      <w:r>
-        <w:lastRenderedPageBreak/>
-        <w:t>teresinense ganha R$ 2.142, bem acima do informal do interior.</w:t>
+        <w:t>Vale contrastar com a capital: em Teresina a razão foi de 2,12, a mais baixa entre os recortes agregados — não porque o formal pague pouco ali, mas porque o informal teresinense ganha R$ 2.142, bem acima do informal do interior.</w:t>
       </w:r>
     </w:p>
     <w:p>
@@ -15354,6 +15886,7 @@
               <w:jc w:val="left"/>
             </w:pPr>
             <w:r>
+              <w:lastRenderedPageBreak/>
               <w:t>Agregados</w:t>
             </w:r>
           </w:p>
@@ -16128,7 +16661,6 @@
               <w:jc w:val="left"/>
             </w:pPr>
             <w:r>
-              <w:lastRenderedPageBreak/>
               <w:t>Estrato agregado</w:t>
             </w:r>
           </w:p>
@@ -17048,6 +17580,7 @@
               <w:jc w:val="left"/>
             </w:pPr>
             <w:r>
+              <w:lastRenderedPageBreak/>
               <w:t>Agregados</w:t>
             </w:r>
           </w:p>
@@ -17822,7 +18355,6 @@
               <w:jc w:val="left"/>
             </w:pPr>
             <w:r>
-              <w:lastRenderedPageBreak/>
               <w:t>Estrato agregado</w:t>
             </w:r>
           </w:p>
@@ -18905,6 +19437,7 @@
           <w:b/>
           <w:bCs/>
         </w:rPr>
+        <w:lastRenderedPageBreak/>
         <w:t>Tabela 17</w:t>
       </w:r>
       <w:r>
@@ -19370,7 +19903,6 @@
               <w:jc w:val="left"/>
             </w:pPr>
             <w:r>
-              <w:lastRenderedPageBreak/>
               <w:t>Zona</w:t>
             </w:r>
           </w:p>
@@ -20842,6 +21374,7 @@
       <w:bookmarkEnd w:id="9"/>
       <w:bookmarkEnd w:id="12"/>
       <w:r>
+        <w:lastRenderedPageBreak/>
         <w:t>3.5 Desalento</w:t>
       </w:r>
     </w:p>
@@ -20859,7 +21392,6 @@
       </w:pPr>
       <w:bookmarkStart w:id="14" w:name="percentual-de-desalentados"/>
       <w:r>
-        <w:lastRenderedPageBreak/>
         <w:t>3.5.1 Percentual de desalentados</w:t>
       </w:r>
     </w:p>
@@ -22795,7 +23327,11 @@
         <w:t xml:space="preserve"> </w:t>
       </w:r>
       <w:r>
-        <w:t xml:space="preserve">Na zona rural a proporção de pessoas desalentadas é maior que desocupados: 10,9% pessoas estavam desocupadas e 16,6% desalentadas, enquanto na zona rural o percentual de desalentados é menor (7,5% desocupados e 3,7% desalentados – embora com CV regular). Quando similar aparece no resto da UF, onde </w:t>
+        <w:t xml:space="preserve">Na zona rural a proporção de pessoas desalentadas é maior que desocupados: 10,9% pessoas estavam desocupadas e 16,6% desalentadas, enquanto na zona rural o percentual de desalentados é menor (7,5% </w:t>
+      </w:r>
+      <w:r>
+        <w:lastRenderedPageBreak/>
+        <w:t xml:space="preserve">desocupados e 3,7% desalentados – embora com CV regular). Quando similar aparece no resto da UF, onde </w:t>
       </w:r>
       <w:r>
         <w:t xml:space="preserve">8,1% estavam desocupados e 10,4% estavam desalentados. Ou seja, a taxa de desocupação </w:t>
@@ -22816,7 +23352,6 @@
       <w:bookmarkStart w:id="15" w:name="jovens-que-não-trabalham-nem-estudam"/>
       <w:bookmarkEnd w:id="14"/>
       <w:r>
-        <w:lastRenderedPageBreak/>
         <w:t>3.5.2 Jovens que não trabalham nem estudam</w:t>
       </w:r>
     </w:p>
@@ -24745,7 +25280,11 @@
         <w:pStyle w:val="Corpodetexto"/>
       </w:pPr>
       <w:r>
-        <w:t>Por estrato geográfico, o cenário mostra que todas as regiões – com exceção da capital – apresenta aproximadamente um quarto dos jovens sem trabalhar ou estudar. Isso pode ter resultados severos na próxima década para a zona rural do Piauí, onde os jovens que ali habitam não acumulam estudo ou experiência e podem permanecer ou retornar a pobreza.</w:t>
+        <w:t xml:space="preserve">Por estrato geográfico, o cenário mostra que todas as regiões – com exceção da capital </w:t>
+      </w:r>
+      <w:r>
+        <w:lastRenderedPageBreak/>
+        <w:t>– apresenta aproximadamente um quarto dos jovens sem trabalhar ou estudar. Isso pode ter resultados severos na próxima década para a zona rural do Piauí, onde os jovens que ali habitam não acumulam estudo ou experiência e podem permanecer ou retornar a pobreza.</w:t>
       </w:r>
     </w:p>
     <w:p>
@@ -24755,7 +25294,6 @@
       <w:bookmarkStart w:id="16" w:name="motivos-para-não-procurar-trabalho"/>
       <w:bookmarkEnd w:id="15"/>
       <w:r>
-        <w:lastRenderedPageBreak/>
         <w:t>3.5.3 Motivos para não procurar trabalho</w:t>
       </w:r>
     </w:p>
@@ -27340,20 +27878,25 @@
               <w:jc w:val="left"/>
             </w:pPr>
             <w:r>
-              <w:t>Tinha que cuidar dos afazeres domésticos</w:t>
-            </w:r>
-          </w:p>
-        </w:tc>
-        <w:tc>
-          <w:tcPr>
-            <w:tcW w:w="0" w:type="auto"/>
-          </w:tcPr>
-          <w:p>
-            <w:pPr>
-              <w:pStyle w:val="Compact"/>
-              <w:jc w:val="right"/>
-            </w:pPr>
-            <w:r>
+              <w:t xml:space="preserve">Tinha que cuidar dos afazeres </w:t>
+            </w:r>
+            <w:r>
+              <w:lastRenderedPageBreak/>
+              <w:t>domésticos</w:t>
+            </w:r>
+          </w:p>
+        </w:tc>
+        <w:tc>
+          <w:tcPr>
+            <w:tcW w:w="0" w:type="auto"/>
+          </w:tcPr>
+          <w:p>
+            <w:pPr>
+              <w:pStyle w:val="Compact"/>
+              <w:jc w:val="right"/>
+            </w:pPr>
+            <w:r>
+              <w:lastRenderedPageBreak/>
               <w:t>0,0</w:t>
             </w:r>
           </w:p>
@@ -27740,25 +28283,20 @@
               <w:jc w:val="left"/>
             </w:pPr>
             <w:r>
-              <w:t xml:space="preserve">Tinha que cuidar dos afazeres </w:t>
-            </w:r>
-            <w:r>
-              <w:lastRenderedPageBreak/>
-              <w:t>domésticos</w:t>
-            </w:r>
-          </w:p>
-        </w:tc>
-        <w:tc>
-          <w:tcPr>
-            <w:tcW w:w="0" w:type="auto"/>
-          </w:tcPr>
-          <w:p>
-            <w:pPr>
-              <w:pStyle w:val="Compact"/>
-              <w:jc w:val="right"/>
-            </w:pPr>
-            <w:r>
-              <w:lastRenderedPageBreak/>
+              <w:t>Tinha que cuidar dos afazeres domésticos</w:t>
+            </w:r>
+          </w:p>
+        </w:tc>
+        <w:tc>
+          <w:tcPr>
+            <w:tcW w:w="0" w:type="auto"/>
+          </w:tcPr>
+          <w:p>
+            <w:pPr>
+              <w:pStyle w:val="Compact"/>
+              <w:jc w:val="right"/>
+            </w:pPr>
+            <w:r>
               <w:t>0,0</w:t>
             </w:r>
           </w:p>
@@ -29770,7 +30308,15 @@
           <w:b/>
           <w:bCs/>
         </w:rPr>
-        <w:t>quase tudo difere entre territórios</w:t>
+        <w:t xml:space="preserve">quase </w:t>
+      </w:r>
+      <w:r>
+        <w:rPr>
+          <w:b/>
+          <w:bCs/>
+        </w:rPr>
+        <w:lastRenderedPageBreak/>
+        <w:t>tudo difere entre territórios</w:t>
       </w:r>
       <w:r>
         <w:t>. Nas quatro colunas em que o teste se sustenta, a esmagadora maioria das células traz três asteriscos. O Piauí não é homogêneo em praticamente nenhuma das dimensões medidas — e a coluna “Teresina × resto” mostra que a capital se destaca do estado em dez dos onze indicadores.</w:t>
@@ -30935,7 +31481,11 @@
         <w:pStyle w:val="FirstParagraph"/>
       </w:pPr>
       <w:r>
-        <w:t>Duas observações que a leitura desta tabela exige. A significância estatística não é relevância prática. Uma diferença pode ser estatisticamente sólida e pequena demais para orientar política pública; e um recorte com poucas observações pode não atingir significância diante de uma diferença real e grande, por falta de amostra.</w:t>
+        <w:t xml:space="preserve">Duas observações que a leitura desta tabela exige. A significância estatística não é </w:t>
+      </w:r>
+      <w:r>
+        <w:lastRenderedPageBreak/>
+        <w:t>relevância prática. Uma diferença pode ser estatisticamente sólida e pequena demais para orientar política pública; e um recorte com poucas observações pode não atingir significância diante de uma diferença real e grande, por falta de amostra.</w:t>
       </w:r>
     </w:p>
     <w:p>
@@ -30946,7 +31496,6 @@
       <w:bookmarkEnd w:id="0"/>
       <w:bookmarkEnd w:id="17"/>
       <w:r>
-        <w:lastRenderedPageBreak/>
         <w:t>4 Considerações finais</w:t>
       </w:r>
     </w:p>
@@ -31003,10 +31552,7 @@
         <w:pStyle w:val="Corpodetexto"/>
       </w:pPr>
       <w:r>
-        <w:t>A análise dos indicadores por diversos recortes geográficos ajuda a elucidar as diferenças regionais intrínsecas dentro do estado</w:t>
-      </w:r>
-      <w:r>
-        <w:t>. Esse acompanhamento trimestral é essencial para identificar as regiões de maior vulnerabilidade com fim de melhor direcionamento das políticas públicas do Estado. Por fim, ressalvamos novamente que as estatísticas ainda são experimentais e que as estimativas acima de 15% não sutem conclusões confiáveis.</w:t>
+        <w:t>A análise dos indicadores por diversos recortes geográficos ajuda a elucidar as diferenças regionais intrínsecas dentro do estado. Esse acompanhamento trimestral é essencial para identificar as regiões de maior vulnerabilidade com fim de melhor direcionamento das políticas públicas do Estado. Por fim, ressalvamos novamente que as estatísticas ainda são experimentais e que as estimativas acima de 15% não sutem conclusões confiáveis.</w:t>
       </w:r>
     </w:p>
     <w:bookmarkEnd w:id="18"/>

</xml_diff>